<commit_message>
delivery challan allignment changes
</commit_message>
<xml_diff>
--- a/ConstructionBilling.Api/Data/deliveryChallan.docx
+++ b/ConstructionBilling.Api/Data/deliveryChallan.docx
@@ -4,6 +4,7 @@
   <w:body>
     <w:p>
       <w:pPr>
+        <w:ind w:left="142"/>
         <w:rPr>
           <w:b/>
           <w:bCs/>
@@ -16,7 +17,7 @@
       <w:tblPr>
         <w:tblStyle w:val="TableGrid"/>
         <w:tblpPr w:leftFromText="180" w:rightFromText="180" w:vertAnchor="page" w:horzAnchor="margin" w:tblpXSpec="center" w:tblpY="831"/>
-        <w:tblW w:w="10990" w:type="dxa"/>
+        <w:tblW w:w="10773" w:type="dxa"/>
         <w:tblBorders>
           <w:insideV w:val="none" w:sz="0" w:space="0" w:color="auto"/>
         </w:tblBorders>
@@ -25,7 +26,7 @@
       </w:tblPr>
       <w:tblGrid>
         <w:gridCol w:w="6238"/>
-        <w:gridCol w:w="4752"/>
+        <w:gridCol w:w="4535"/>
       </w:tblGrid>
       <w:tr>
         <w:trPr>
@@ -33,7 +34,7 @@
         </w:trPr>
         <w:tc>
           <w:tcPr>
-            <w:tcW w:w="10990" w:type="dxa"/>
+            <w:tcW w:w="10773" w:type="dxa"/>
             <w:gridSpan w:val="2"/>
             <w:tcBorders>
               <w:top w:val="nil"/>
@@ -164,8 +165,6 @@
                 <w:bCs/>
               </w:rPr>
             </w:pPr>
-            <w:proofErr w:type="spellStart"/>
-            <w:proofErr w:type="spellEnd"/>
             <w:r>
               <w:rPr>
                 <w:b/>
@@ -188,8 +187,6 @@
               </w:rPr>
               <w:t xml:space="preserve">MANUFACTURES OF: </w:t>
             </w:r>
-            <w:proofErr w:type="spellStart"/>
-            <w:proofErr w:type="spellEnd"/>
             <w:r>
               <w:rPr>
                 <w:rFonts w:cstheme="minorHAnsi"/>
@@ -229,7 +226,7 @@
         </w:tc>
         <w:tc>
           <w:tcPr>
-            <w:tcW w:w="4751" w:type="dxa"/>
+            <w:tcW w:w="4535" w:type="dxa"/>
             <w:tcBorders>
               <w:top w:val="single" w:sz="4" w:space="0" w:color="auto"/>
               <w:left w:val="single" w:sz="4" w:space="0" w:color="auto"/>
@@ -348,48 +345,14 @@
                 <w:b/>
                 <w:bCs/>
               </w:rPr>
-              <w:t xml:space="preserve">  </w:t>
+              <w:t>Email:</w:t>
             </w:r>
             <w:r>
               <w:rPr>
                 <w:rFonts w:cstheme="minorHAnsi"/>
-                <w:b/>
-                <w:bCs/>
-              </w:rPr>
-              <w:t xml:space="preserve">  </w:t>
-            </w:r>
-            <w:r>
-              <w:rPr>
-                <w:rFonts w:cstheme="minorHAnsi"/>
-                <w:b/>
-                <w:bCs/>
               </w:rPr>
               <w:t xml:space="preserve"> </w:t>
             </w:r>
-            <w:r>
-              <w:rPr>
-                <w:rFonts w:cstheme="minorHAnsi"/>
-                <w:b/>
-                <w:bCs/>
-              </w:rPr>
-              <w:t xml:space="preserve"> </w:t>
-            </w:r>
-            <w:r>
-              <w:rPr>
-                <w:rFonts w:cstheme="minorHAnsi"/>
-                <w:b/>
-                <w:bCs/>
-              </w:rPr>
-              <w:t>Email:</w:t>
-            </w:r>
-            <w:r>
-              <w:rPr>
-                <w:rFonts w:cstheme="minorHAnsi"/>
-              </w:rPr>
-              <w:t xml:space="preserve"> </w:t>
-            </w:r>
-            <w:proofErr w:type="spellStart"/>
-            <w:proofErr w:type="spellEnd"/>
             <w:r>
               <w:rPr>
                 <w:rFonts w:cstheme="minorHAnsi"/>
@@ -405,38 +368,6 @@
                 <w:szCs w:val="24"/>
               </w:rPr>
             </w:pPr>
-            <w:r>
-              <w:rPr>
-                <w:rFonts w:cstheme="minorHAnsi"/>
-                <w:b/>
-                <w:bCs/>
-              </w:rPr>
-              <w:t xml:space="preserve">  </w:t>
-            </w:r>
-            <w:r>
-              <w:rPr>
-                <w:rFonts w:cstheme="minorHAnsi"/>
-                <w:b/>
-                <w:bCs/>
-              </w:rPr>
-              <w:t xml:space="preserve">  </w:t>
-            </w:r>
-            <w:r>
-              <w:rPr>
-                <w:rFonts w:cstheme="minorHAnsi"/>
-                <w:b/>
-                <w:bCs/>
-              </w:rPr>
-              <w:t xml:space="preserve"> </w:t>
-            </w:r>
-            <w:r>
-              <w:rPr>
-                <w:rFonts w:cstheme="minorHAnsi"/>
-                <w:b/>
-                <w:bCs/>
-              </w:rPr>
-              <w:t xml:space="preserve"> </w:t>
-            </w:r>
             <w:r>
               <w:rPr>
                 <w:rFonts w:cstheme="minorHAnsi"/>
@@ -510,14 +441,12 @@
                 <w:bCs/>
               </w:rPr>
             </w:pPr>
-            <w:proofErr w:type="spellStart"/>
-            <w:proofErr w:type="spellEnd"/>
-            <w:r>
-              <w:rPr>
-                <w:b/>
-                <w:bCs/>
-              </w:rPr>
-              <w:t>DHANASEKAR,</w:t>
+            <w:r>
+              <w:rPr>
+                <w:b/>
+                <w:bCs/>
+              </w:rPr>
+              <w:t>Naaval Paradise Apartment,</w:t>
             </w:r>
             <w:r>
               <w:rPr>
@@ -531,7 +460,7 @@
                 <w:b/>
                 <w:bCs/>
               </w:rPr>
-              <w:t>NEAR  KALAIMAGAL SCHOOL,</w:t>
+              <w:t>Yercaud road,</w:t>
             </w:r>
             <w:r>
               <w:rPr>
@@ -545,7 +474,7 @@
                 <w:b/>
                 <w:bCs/>
               </w:rPr>
-              <w:t>AMMAPET.</w:t>
+              <w:t>Salem.</w:t>
             </w:r>
             <w:r>
               <w:rPr>
@@ -559,13 +488,13 @@
                 <w:b/>
                 <w:bCs/>
               </w:rPr>
-              <w:t>PH.NO:8825863651</w:t>
+              <w:t>0000000000</w:t>
             </w:r>
           </w:p>
         </w:tc>
         <w:tc>
           <w:tcPr>
-            <w:tcW w:w="4751" w:type="dxa"/>
+            <w:tcW w:w="4535" w:type="dxa"/>
             <w:tcBorders>
               <w:left w:val="single" w:sz="4" w:space="0" w:color="auto"/>
             </w:tcBorders>
@@ -585,14 +514,12 @@
               </w:rPr>
               <w:t xml:space="preserve">Delivery Challan No: </w:t>
             </w:r>
-            <w:proofErr w:type="spellStart"/>
-            <w:proofErr w:type="spellEnd"/>
-            <w:r>
-              <w:rPr>
-                <w:sz w:val="20"/>
-                <w:szCs w:val="20"/>
-              </w:rPr>
-              <w:t>93</w:t>
+            <w:r>
+              <w:rPr>
+                <w:sz w:val="20"/>
+                <w:szCs w:val="20"/>
+              </w:rPr>
+              <w:t>2026/001</w:t>
             </w:r>
           </w:p>
           <w:p>
@@ -610,14 +537,12 @@
               </w:rPr>
               <w:t xml:space="preserve">Delivery Challen Date: </w:t>
             </w:r>
-            <w:proofErr w:type="spellStart"/>
-            <w:proofErr w:type="spellEnd"/>
-            <w:r>
-              <w:rPr>
-                <w:sz w:val="20"/>
-                <w:szCs w:val="20"/>
-              </w:rPr>
-              <w:t>26/05/2026</w:t>
+            <w:r>
+              <w:rPr>
+                <w:sz w:val="20"/>
+                <w:szCs w:val="20"/>
+              </w:rPr>
+              <w:t>01/04/2026</w:t>
             </w:r>
           </w:p>
           <w:p>
@@ -662,8 +587,6 @@
               </w:rPr>
               <w:t xml:space="preserve">: </w:t>
             </w:r>
-            <w:proofErr w:type="spellStart"/>
-            <w:proofErr w:type="spellEnd"/>
             <w:r>
               <w:rPr>
                 <w:sz w:val="20"/>
@@ -700,14 +623,12 @@
               </w:rPr>
               <w:t xml:space="preserve">: </w:t>
             </w:r>
-            <w:proofErr w:type="spellStart"/>
-            <w:proofErr w:type="spellEnd"/>
-            <w:r>
-              <w:rPr>
-                <w:sz w:val="20"/>
-                <w:szCs w:val="20"/>
-              </w:rPr>
-              <w:t xml:space="preserve">TN 52 T9610-RAMESH </w:t>
+            <w:r>
+              <w:rPr>
+                <w:sz w:val="20"/>
+                <w:szCs w:val="20"/>
+              </w:rPr>
+              <w:t>TN52T9610-RAMESH (CSK)</w:t>
             </w:r>
           </w:p>
         </w:tc>
@@ -718,7 +639,7 @@
         </w:trPr>
         <w:tc>
           <w:tcPr>
-            <w:tcW w:w="10990" w:type="dxa"/>
+            <w:tcW w:w="10773" w:type="dxa"/>
             <w:gridSpan w:val="2"/>
           </w:tcPr>
           <w:p>
@@ -762,7 +683,7 @@
               <w:gridCol w:w="688.6868286132812"/>
               <w:gridCol w:w="6886.868896484375"/>
               <w:gridCol w:w="2164.444580078125"/>
-              <w:gridCol w:w="1479.4937133789062"/>
+              <w:gridCol w:w="1145.882339477539"/>
             </w:tblGrid>
             <w:tr>
               <w:tc>
@@ -815,7 +736,7 @@
               </w:tc>
               <w:tc>
                 <w:tcPr>
-                  <w:tcW w:w="1479.4937133789062" w:type="dxa"/>
+                  <w:tcW w:w="1145.882339477539" w:type="dxa"/>
                 </w:tcPr>
                 <w:p>
                   <w:pPr/>
@@ -836,8 +757,15 @@
                   <w:tcW w:w="688.6868286132812" w:type="dxa"/>
                 </w:tcPr>
                 <w:p>
-                  <w:pPr/>
+                  <w:pPr>
+                    <w:jc w:val="center"/>
+                  </w:pPr>
                   <w:r>
+                    <w:rPr>
+                      <w:rFonts w:ascii="Arial" w:hAnsi="Arial" w:cs="Arial" w:eastAsia="Arial"/>
+                      <w:sz w:val="20"/>
+                      <w:szCs w:val="20"/>
+                    </w:rPr>
                     <w:t>1</w:t>
                   </w:r>
                 </w:p>
@@ -854,7 +782,7 @@
                       <w:sz w:val="20"/>
                       <w:szCs w:val="20"/>
                     </w:rPr>
-                    <w:t>FLY ASH BRICKS(230/105/75) B.NO(08/04/26)</w:t>
+                    <w:t>Fly ASH Bricks 230*105*75</w:t>
                   </w:r>
                 </w:p>
               </w:tc>
@@ -876,7 +804,7 @@
               </w:tc>
               <w:tc>
                 <w:tcPr>
-                  <w:tcW w:w="1479.4937133789062" w:type="dxa"/>
+                  <w:tcW w:w="1145.882339477539" w:type="dxa"/>
                 </w:tcPr>
                 <w:p>
                   <w:pPr/>
@@ -886,7 +814,7 @@
                       <w:sz w:val="20"/>
                       <w:szCs w:val="20"/>
                     </w:rPr>
-                    <w:t>19500.00</w:t>
+                    <w:t>20092.80</w:t>
                   </w:r>
                 </w:p>
               </w:tc>
@@ -921,7 +849,7 @@
         </w:trPr>
         <w:tc>
           <w:tcPr>
-            <w:tcW w:w="10990" w:type="dxa"/>
+            <w:tcW w:w="10773" w:type="dxa"/>
             <w:gridSpan w:val="2"/>
             <w:tcBorders>
               <w:bottom w:val="single" w:sz="4" w:space="0" w:color="auto"/>
@@ -941,15 +869,13 @@
               </w:rPr>
               <w:t xml:space="preserve">Amount (In Words):  </w:t>
             </w:r>
-            <w:proofErr w:type="spellStart"/>
-            <w:proofErr w:type="spellEnd"/>
-            <w:r>
-              <w:rPr>
-                <w:b/>
-                <w:sz w:val="20"/>
-                <w:szCs w:val="20"/>
-              </w:rPr>
-              <w:t>Nineteen thousand five hundred  only/-</w:t>
+            <w:r>
+              <w:rPr>
+                <w:b/>
+                <w:sz w:val="20"/>
+                <w:szCs w:val="20"/>
+              </w:rPr>
+              <w:t>Twenty thousand and ninety-two point eighty only/-</w:t>
             </w:r>
             <w:r>
               <w:rPr>
@@ -974,7 +900,7 @@
         </w:trPr>
         <w:tc>
           <w:tcPr>
-            <w:tcW w:w="10990" w:type="dxa"/>
+            <w:tcW w:w="10773" w:type="dxa"/>
             <w:gridSpan w:val="2"/>
             <w:tcBorders>
               <w:bottom w:val="single" w:sz="4" w:space="0" w:color="auto"/>
@@ -1031,7 +957,7 @@
                 <w:p>
                   <w:pPr>
                     <w:framePr w:hSpace="180" w:wrap="around" w:vAnchor="page" w:hAnchor="margin" w:xAlign="center" w:y="831"/>
-                    <w:jc w:val="right"/>
+                    <w:jc w:val="center"/>
                     <w:rPr>
                       <w:b/>
                       <w:bCs/>
@@ -1045,10 +971,18 @@
                       <w:sz w:val="20"/>
                       <w:szCs w:val="20"/>
                     </w:rPr>
+                    <w:t xml:space="preserve">                                               </w:t>
+                  </w:r>
+                  <w:r>
+                    <w:rPr>
+                      <w:rFonts w:ascii="Arial" w:hAnsi="Arial" w:cs="Arial"/>
+                      <w:b/>
+                      <w:bCs/>
+                      <w:sz w:val="20"/>
+                      <w:szCs w:val="20"/>
+                    </w:rPr>
                     <w:t xml:space="preserve">For </w:t>
                   </w:r>
-                  <w:proofErr w:type="spellStart"/>
-                  <w:proofErr w:type="spellEnd"/>
                   <w:r>
                     <w:rPr>
                       <w:b/>
@@ -1098,7 +1032,7 @@
         </w:trPr>
         <w:tc>
           <w:tcPr>
-            <w:tcW w:w="10990" w:type="dxa"/>
+            <w:tcW w:w="10773" w:type="dxa"/>
             <w:gridSpan w:val="2"/>
             <w:tcBorders>
               <w:top w:val="dashed" w:sz="8" w:space="0" w:color="000000"/>
@@ -1122,31 +1056,13 @@
               </w:rPr>
               <w:t xml:space="preserve">                                                          </w:t>
             </w:r>
-            <w:proofErr w:type="gramStart"/>
             <w:r>
               <w:rPr>
                 <w:sz w:val="18"/>
                 <w:szCs w:val="18"/>
               </w:rPr>
-              <w:t>✂  -</w:t>
-            </w:r>
-            <w:proofErr w:type="gramEnd"/>
-            <w:r>
-              <w:rPr>
-                <w:sz w:val="18"/>
-                <w:szCs w:val="18"/>
-              </w:rPr>
-              <w:t xml:space="preserve"> - - - - - - - - - - - - - - - - - - - - - - - - - - TEAR HERE - - - - - - - - - - - - - - - - - - - - - - - - - - </w:t>
-            </w:r>
-            <w:proofErr w:type="gramStart"/>
-            <w:r>
-              <w:rPr>
-                <w:sz w:val="18"/>
-                <w:szCs w:val="18"/>
-              </w:rPr>
-              <w:t>-  ✂</w:t>
-            </w:r>
-            <w:proofErr w:type="gramEnd"/>
+              <w:t>✂  - - - - - - - - - - - - - - - - - - - - - - - - - - - TEAR HERE - - - - - - - - - - - - - - - - - - - - - - - - - - -  ✂</w:t>
+            </w:r>
           </w:p>
         </w:tc>
       </w:tr>
@@ -1156,7 +1072,7 @@
         </w:trPr>
         <w:tc>
           <w:tcPr>
-            <w:tcW w:w="10990" w:type="dxa"/>
+            <w:tcW w:w="10773" w:type="dxa"/>
             <w:gridSpan w:val="2"/>
             <w:tcBorders>
               <w:top w:val="nil"/>
@@ -1288,8 +1204,6 @@
                 <w:bCs/>
               </w:rPr>
             </w:pPr>
-            <w:proofErr w:type="spellStart"/>
-            <w:proofErr w:type="spellEnd"/>
             <w:r>
               <w:rPr>
                 <w:b/>
@@ -1312,8 +1226,6 @@
               </w:rPr>
               <w:t xml:space="preserve">MANUFACTURES OF: </w:t>
             </w:r>
-            <w:proofErr w:type="spellStart"/>
-            <w:proofErr w:type="spellEnd"/>
             <w:r>
               <w:rPr>
                 <w:rFonts w:cstheme="minorHAnsi"/>
@@ -1353,7 +1265,7 @@
         </w:tc>
         <w:tc>
           <w:tcPr>
-            <w:tcW w:w="4751" w:type="dxa"/>
+            <w:tcW w:w="4535" w:type="dxa"/>
             <w:tcBorders>
               <w:left w:val="single" w:sz="4" w:space="0" w:color="auto"/>
             </w:tcBorders>
@@ -1463,7 +1375,7 @@
                 <w:b/>
                 <w:bCs/>
               </w:rPr>
-              <w:t xml:space="preserve">  </w:t>
+              <w:t xml:space="preserve"> </w:t>
             </w:r>
             <w:r>
               <w:rPr>
@@ -1471,48 +1383,14 @@
                 <w:b/>
                 <w:bCs/>
               </w:rPr>
+              <w:t>Email:</w:t>
+            </w:r>
+            <w:r>
+              <w:rPr>
+                <w:rFonts w:cstheme="minorHAnsi"/>
+              </w:rPr>
               <w:t xml:space="preserve"> </w:t>
             </w:r>
-            <w:r>
-              <w:rPr>
-                <w:rFonts w:cstheme="minorHAnsi"/>
-                <w:b/>
-                <w:bCs/>
-              </w:rPr>
-              <w:t xml:space="preserve">  </w:t>
-            </w:r>
-            <w:r>
-              <w:rPr>
-                <w:rFonts w:cstheme="minorHAnsi"/>
-                <w:b/>
-                <w:bCs/>
-              </w:rPr>
-              <w:t xml:space="preserve"> </w:t>
-            </w:r>
-            <w:r>
-              <w:rPr>
-                <w:rFonts w:cstheme="minorHAnsi"/>
-                <w:b/>
-                <w:bCs/>
-              </w:rPr>
-              <w:t xml:space="preserve"> </w:t>
-            </w:r>
-            <w:r>
-              <w:rPr>
-                <w:rFonts w:cstheme="minorHAnsi"/>
-                <w:b/>
-                <w:bCs/>
-              </w:rPr>
-              <w:t>Email:</w:t>
-            </w:r>
-            <w:r>
-              <w:rPr>
-                <w:rFonts w:cstheme="minorHAnsi"/>
-              </w:rPr>
-              <w:t xml:space="preserve"> </w:t>
-            </w:r>
-            <w:proofErr w:type="spellStart"/>
-            <w:proofErr w:type="spellEnd"/>
             <w:r>
               <w:rPr>
                 <w:rFonts w:cstheme="minorHAnsi"/>
@@ -1528,30 +1406,6 @@
                 <w:szCs w:val="24"/>
               </w:rPr>
             </w:pPr>
-            <w:r>
-              <w:rPr>
-                <w:rFonts w:cstheme="minorHAnsi"/>
-                <w:b/>
-                <w:bCs/>
-              </w:rPr>
-              <w:t xml:space="preserve">   </w:t>
-            </w:r>
-            <w:r>
-              <w:rPr>
-                <w:rFonts w:cstheme="minorHAnsi"/>
-                <w:b/>
-                <w:bCs/>
-              </w:rPr>
-              <w:t xml:space="preserve">  </w:t>
-            </w:r>
-            <w:r>
-              <w:rPr>
-                <w:rFonts w:cstheme="minorHAnsi"/>
-                <w:b/>
-                <w:bCs/>
-              </w:rPr>
-              <w:t xml:space="preserve"> </w:t>
-            </w:r>
             <w:r>
               <w:rPr>
                 <w:rFonts w:cstheme="minorHAnsi"/>
@@ -1625,14 +1479,12 @@
                 <w:bCs/>
               </w:rPr>
             </w:pPr>
-            <w:proofErr w:type="spellStart"/>
-            <w:proofErr w:type="spellEnd"/>
-            <w:r>
-              <w:rPr>
-                <w:b/>
-                <w:bCs/>
-              </w:rPr>
-              <w:t>DHANASEKAR,</w:t>
+            <w:r>
+              <w:rPr>
+                <w:b/>
+                <w:bCs/>
+              </w:rPr>
+              <w:t>Naaval Paradise Apartment,</w:t>
             </w:r>
             <w:r>
               <w:rPr>
@@ -1646,7 +1498,7 @@
                 <w:b/>
                 <w:bCs/>
               </w:rPr>
-              <w:t>NEAR  KALAIMAGAL SCHOOL,</w:t>
+              <w:t>Yercaud road,</w:t>
             </w:r>
             <w:r>
               <w:rPr>
@@ -1660,7 +1512,7 @@
                 <w:b/>
                 <w:bCs/>
               </w:rPr>
-              <w:t>AMMAPET.</w:t>
+              <w:t>Salem.</w:t>
             </w:r>
             <w:r>
               <w:rPr>
@@ -1674,13 +1526,13 @@
                 <w:b/>
                 <w:bCs/>
               </w:rPr>
-              <w:t>PH.NO:8825863651</w:t>
+              <w:t>0000000000</w:t>
             </w:r>
           </w:p>
         </w:tc>
         <w:tc>
           <w:tcPr>
-            <w:tcW w:w="4751" w:type="dxa"/>
+            <w:tcW w:w="4535" w:type="dxa"/>
             <w:tcBorders>
               <w:left w:val="single" w:sz="4" w:space="0" w:color="auto"/>
             </w:tcBorders>
@@ -1700,14 +1552,12 @@
               </w:rPr>
               <w:t xml:space="preserve">Delivery Challan No: </w:t>
             </w:r>
-            <w:proofErr w:type="spellStart"/>
-            <w:proofErr w:type="spellEnd"/>
-            <w:r>
-              <w:rPr>
-                <w:sz w:val="20"/>
-                <w:szCs w:val="20"/>
-              </w:rPr>
-              <w:t>93</w:t>
+            <w:r>
+              <w:rPr>
+                <w:sz w:val="20"/>
+                <w:szCs w:val="20"/>
+              </w:rPr>
+              <w:t>2026/001</w:t>
             </w:r>
           </w:p>
           <w:p>
@@ -1725,14 +1575,12 @@
               </w:rPr>
               <w:t xml:space="preserve">Delivery Challen Date: </w:t>
             </w:r>
-            <w:proofErr w:type="spellStart"/>
-            <w:proofErr w:type="spellEnd"/>
-            <w:r>
-              <w:rPr>
-                <w:sz w:val="20"/>
-                <w:szCs w:val="20"/>
-              </w:rPr>
-              <w:t>26/05/2026</w:t>
+            <w:r>
+              <w:rPr>
+                <w:sz w:val="20"/>
+                <w:szCs w:val="20"/>
+              </w:rPr>
+              <w:t>01/04/2026</w:t>
             </w:r>
           </w:p>
           <w:p>
@@ -1784,8 +1632,6 @@
               </w:rPr>
               <w:t xml:space="preserve">: </w:t>
             </w:r>
-            <w:proofErr w:type="spellStart"/>
-            <w:proofErr w:type="spellEnd"/>
             <w:r>
               <w:rPr>
                 <w:sz w:val="20"/>
@@ -1822,14 +1668,12 @@
               </w:rPr>
               <w:t xml:space="preserve">: </w:t>
             </w:r>
-            <w:proofErr w:type="spellStart"/>
-            <w:proofErr w:type="spellEnd"/>
-            <w:r>
-              <w:rPr>
-                <w:sz w:val="20"/>
-                <w:szCs w:val="20"/>
-              </w:rPr>
-              <w:t xml:space="preserve">TN 52 T9610-RAMESH </w:t>
+            <w:r>
+              <w:rPr>
+                <w:sz w:val="20"/>
+                <w:szCs w:val="20"/>
+              </w:rPr>
+              <w:t>TN52T9610-RAMESH (CSK)</w:t>
             </w:r>
           </w:p>
         </w:tc>
@@ -1840,7 +1684,7 @@
         </w:trPr>
         <w:tc>
           <w:tcPr>
-            <w:tcW w:w="10990" w:type="dxa"/>
+            <w:tcW w:w="10773" w:type="dxa"/>
             <w:gridSpan w:val="2"/>
           </w:tcPr>
           <w:p>
@@ -1884,7 +1728,7 @@
               <w:gridCol w:w="688.6868286132812"/>
               <w:gridCol w:w="6886.868896484375"/>
               <w:gridCol w:w="2164.444580078125"/>
-              <w:gridCol w:w="1479.4937133789062"/>
+              <w:gridCol w:w="1145.882339477539"/>
             </w:tblGrid>
             <w:tr>
               <w:tc>
@@ -1937,7 +1781,7 @@
               </w:tc>
               <w:tc>
                 <w:tcPr>
-                  <w:tcW w:w="1479.4937133789062" w:type="dxa"/>
+                  <w:tcW w:w="1145.882339477539" w:type="dxa"/>
                 </w:tcPr>
                 <w:p>
                   <w:pPr/>
@@ -1958,8 +1802,15 @@
                   <w:tcW w:w="688.6868286132812" w:type="dxa"/>
                 </w:tcPr>
                 <w:p>
-                  <w:pPr/>
+                  <w:pPr>
+                    <w:jc w:val="center"/>
+                  </w:pPr>
                   <w:r>
+                    <w:rPr>
+                      <w:rFonts w:ascii="Arial" w:hAnsi="Arial" w:cs="Arial" w:eastAsia="Arial"/>
+                      <w:sz w:val="20"/>
+                      <w:szCs w:val="20"/>
+                    </w:rPr>
                     <w:t>1</w:t>
                   </w:r>
                 </w:p>
@@ -1976,7 +1827,7 @@
                       <w:sz w:val="20"/>
                       <w:szCs w:val="20"/>
                     </w:rPr>
-                    <w:t>FLY ASH BRICKS(230/105/75) B.NO(08/04/26)</w:t>
+                    <w:t>Fly ASH Bricks 230*105*75</w:t>
                   </w:r>
                 </w:p>
               </w:tc>
@@ -1998,7 +1849,7 @@
               </w:tc>
               <w:tc>
                 <w:tcPr>
-                  <w:tcW w:w="1479.4937133789062" w:type="dxa"/>
+                  <w:tcW w:w="1145.882339477539" w:type="dxa"/>
                 </w:tcPr>
                 <w:p>
                   <w:pPr/>
@@ -2008,7 +1859,7 @@
                       <w:sz w:val="20"/>
                       <w:szCs w:val="20"/>
                     </w:rPr>
-                    <w:t>19500.00</w:t>
+                    <w:t>20092.80</w:t>
                   </w:r>
                 </w:p>
               </w:tc>
@@ -2043,7 +1894,7 @@
         </w:trPr>
         <w:tc>
           <w:tcPr>
-            <w:tcW w:w="10990" w:type="dxa"/>
+            <w:tcW w:w="10773" w:type="dxa"/>
             <w:gridSpan w:val="2"/>
             <w:tcBorders>
               <w:bottom w:val="single" w:sz="4" w:space="0" w:color="auto"/>
@@ -2063,15 +1914,13 @@
               </w:rPr>
               <w:t xml:space="preserve">Amount (In Words):  </w:t>
             </w:r>
-            <w:proofErr w:type="spellStart"/>
-            <w:proofErr w:type="spellEnd"/>
-            <w:r>
-              <w:rPr>
-                <w:b/>
-                <w:sz w:val="20"/>
-                <w:szCs w:val="20"/>
-              </w:rPr>
-              <w:t>Nineteen thousand five hundred  only/-</w:t>
+            <w:r>
+              <w:rPr>
+                <w:b/>
+                <w:sz w:val="20"/>
+                <w:szCs w:val="20"/>
+              </w:rPr>
+              <w:t>Twenty thousand and ninety-two point eighty only/-</w:t>
             </w:r>
             <w:r>
               <w:rPr>
@@ -2096,7 +1945,7 @@
         </w:trPr>
         <w:tc>
           <w:tcPr>
-            <w:tcW w:w="10990" w:type="dxa"/>
+            <w:tcW w:w="10773" w:type="dxa"/>
             <w:gridSpan w:val="2"/>
           </w:tcPr>
           <w:tbl>
@@ -2150,7 +1999,7 @@
                 <w:p>
                   <w:pPr>
                     <w:framePr w:hSpace="180" w:wrap="around" w:vAnchor="page" w:hAnchor="margin" w:xAlign="center" w:y="831"/>
-                    <w:jc w:val="right"/>
+                    <w:jc w:val="center"/>
                     <w:rPr>
                       <w:b/>
                       <w:bCs/>
@@ -2164,10 +2013,18 @@
                       <w:sz w:val="20"/>
                       <w:szCs w:val="20"/>
                     </w:rPr>
+                    <w:t xml:space="preserve">                                                </w:t>
+                  </w:r>
+                  <w:r>
+                    <w:rPr>
+                      <w:rFonts w:ascii="Arial" w:hAnsi="Arial" w:cs="Arial"/>
+                      <w:b/>
+                      <w:bCs/>
+                      <w:sz w:val="20"/>
+                      <w:szCs w:val="20"/>
+                    </w:rPr>
                     <w:t xml:space="preserve">For </w:t>
                   </w:r>
-                  <w:proofErr w:type="spellStart"/>
-                  <w:proofErr w:type="spellEnd"/>
                   <w:r>
                     <w:rPr>
                       <w:b/>

</xml_diff>